<commit_message>
Add link button for project docs
</commit_message>
<xml_diff>
--- a/public/files/windows-lab-project1.docx
+++ b/public/files/windows-lab-project1.docx
@@ -71,7 +71,7 @@
           <w:noProof/>
         </w:rPr>
         <w:drawing>
-          <wp:inline distT="0" distB="0" distL="0" distR="0" wp14:anchorId="1F9D2BF1" wp14:editId="29B9F4B1">
+          <wp:inline distT="0" distB="0" distL="0" distR="0" wp14:anchorId="36F52C32" wp14:editId="76AD476A">
             <wp:extent cx="4168140" cy="2996368"/>
             <wp:effectExtent l="0" t="0" r="3810" b="0"/>
             <wp:docPr id="328683748" name="Picture 1"/>
@@ -164,7 +164,7 @@
         </w:rPr>
         <w:lastRenderedPageBreak/>
         <w:drawing>
-          <wp:inline distT="0" distB="0" distL="0" distR="0" wp14:anchorId="58DBD10E" wp14:editId="03EFD91C">
+          <wp:inline distT="0" distB="0" distL="0" distR="0" wp14:anchorId="709991C2" wp14:editId="4E79C12D">
             <wp:extent cx="4572000" cy="2743200"/>
             <wp:effectExtent l="0" t="0" r="0" b="0"/>
             <wp:docPr id="19" name="Picture 19"/>
@@ -238,7 +238,7 @@
           <w:noProof/>
         </w:rPr>
         <w:drawing>
-          <wp:inline distT="0" distB="0" distL="0" distR="0" wp14:anchorId="2368C48A" wp14:editId="0548B2E9">
+          <wp:inline distT="0" distB="0" distL="0" distR="0" wp14:anchorId="2FF4C55F" wp14:editId="5C44A82C">
             <wp:extent cx="4572000" cy="2743200"/>
             <wp:effectExtent l="0" t="0" r="0" b="0"/>
             <wp:docPr id="29" name="Picture 29"/>
@@ -304,7 +304,7 @@
         </w:rPr>
         <w:lastRenderedPageBreak/>
         <w:drawing>
-          <wp:inline distT="0" distB="0" distL="0" distR="0" wp14:anchorId="510440C7" wp14:editId="2B35EB9C">
+          <wp:inline distT="0" distB="0" distL="0" distR="0" wp14:anchorId="50F497F2" wp14:editId="5275F156">
             <wp:extent cx="4572000" cy="3657600"/>
             <wp:effectExtent l="0" t="0" r="0" b="0"/>
             <wp:docPr id="34" name="Picture 34"/>
@@ -378,7 +378,7 @@
           <w:noProof/>
         </w:rPr>
         <w:drawing>
-          <wp:inline distT="0" distB="0" distL="0" distR="0" wp14:anchorId="4E9C86EE" wp14:editId="65F12855">
+          <wp:inline distT="0" distB="0" distL="0" distR="0" wp14:anchorId="11B84297" wp14:editId="64DF663B">
             <wp:extent cx="4572000" cy="2743200"/>
             <wp:effectExtent l="0" t="0" r="0" b="0"/>
             <wp:docPr id="42" name="Picture 42"/>
@@ -443,6 +443,7 @@
         <w:t>This lab demonstrates the deployment and security configuration of an Active Directory environment. Network configuration, Group Policy enforcement, and security monitoring were implemented to simulate real-world enterprise security practices.</w:t>
       </w:r>
     </w:p>
+    <w:p/>
     <w:sectPr>
       <w:pgSz w:w="12240" w:h="15840"/>
       <w:pgMar w:top="1616" w:right="1620" w:bottom="1631" w:left="1560" w:header="720" w:footer="720" w:gutter="0"/>
@@ -457,7 +458,7 @@
   <w:docDefaults>
     <w:rPrDefault>
       <w:rPr>
-        <w:rFonts w:asciiTheme="minorHAnsi" w:eastAsiaTheme="minorEastAsia" w:hAnsiTheme="minorHAnsi" w:cstheme="minorBidi"/>
+        <w:rFonts w:asciiTheme="minorHAnsi" w:eastAsiaTheme="minorHAnsi" w:hAnsiTheme="minorHAnsi" w:cstheme="minorBidi"/>
         <w:kern w:val="2"/>
         <w:sz w:val="24"/>
         <w:szCs w:val="24"/>
@@ -852,6 +853,7 @@
   <w:style w:type="paragraph" w:default="1" w:styleId="Normal">
     <w:name w:val="Normal"/>
     <w:qFormat/>
+    <w:rsid w:val="00EB775C"/>
     <w:pPr>
       <w:spacing w:after="3" w:line="261" w:lineRule="auto"/>
       <w:ind w:left="10" w:hanging="10"/>
@@ -864,22 +866,216 @@
   </w:style>
   <w:style w:type="paragraph" w:styleId="Heading1">
     <w:name w:val="heading 1"/>
+    <w:basedOn w:val="Normal"/>
     <w:next w:val="Normal"/>
     <w:link w:val="Heading1Char"/>
     <w:uiPriority w:val="9"/>
     <w:qFormat/>
+    <w:rsid w:val="00EB775C"/>
     <w:pPr>
       <w:keepNext/>
       <w:keepLines/>
-      <w:spacing w:after="316" w:line="259" w:lineRule="auto"/>
-      <w:ind w:left="10" w:hanging="10"/>
+      <w:spacing w:before="360" w:after="80" w:line="278" w:lineRule="auto"/>
+      <w:ind w:left="0" w:firstLine="0"/>
       <w:outlineLvl w:val="0"/>
     </w:pPr>
     <w:rPr>
-      <w:rFonts w:ascii="Arial" w:eastAsia="Arial" w:hAnsi="Arial" w:cs="Arial"/>
-      <w:b/>
-      <w:color w:val="000000"/>
+      <w:rFonts w:asciiTheme="majorHAnsi" w:eastAsiaTheme="majorEastAsia" w:hAnsiTheme="majorHAnsi" w:cstheme="majorBidi"/>
+      <w:color w:val="0F4761" w:themeColor="accent1" w:themeShade="BF"/>
+      <w:sz w:val="40"/>
+      <w:szCs w:val="40"/>
+    </w:rPr>
+  </w:style>
+  <w:style w:type="paragraph" w:styleId="Heading2">
+    <w:name w:val="heading 2"/>
+    <w:basedOn w:val="Normal"/>
+    <w:next w:val="Normal"/>
+    <w:link w:val="Heading2Char"/>
+    <w:uiPriority w:val="9"/>
+    <w:semiHidden/>
+    <w:unhideWhenUsed/>
+    <w:qFormat/>
+    <w:rsid w:val="00EB775C"/>
+    <w:pPr>
+      <w:keepNext/>
+      <w:keepLines/>
+      <w:spacing w:before="160" w:after="80" w:line="278" w:lineRule="auto"/>
+      <w:ind w:left="0" w:firstLine="0"/>
+      <w:outlineLvl w:val="1"/>
+    </w:pPr>
+    <w:rPr>
+      <w:rFonts w:asciiTheme="majorHAnsi" w:eastAsiaTheme="majorEastAsia" w:hAnsiTheme="majorHAnsi" w:cstheme="majorBidi"/>
+      <w:color w:val="0F4761" w:themeColor="accent1" w:themeShade="BF"/>
+      <w:sz w:val="32"/>
+      <w:szCs w:val="32"/>
+    </w:rPr>
+  </w:style>
+  <w:style w:type="paragraph" w:styleId="Heading3">
+    <w:name w:val="heading 3"/>
+    <w:basedOn w:val="Normal"/>
+    <w:next w:val="Normal"/>
+    <w:link w:val="Heading3Char"/>
+    <w:uiPriority w:val="9"/>
+    <w:semiHidden/>
+    <w:unhideWhenUsed/>
+    <w:qFormat/>
+    <w:rsid w:val="00EB775C"/>
+    <w:pPr>
+      <w:keepNext/>
+      <w:keepLines/>
+      <w:spacing w:before="160" w:after="80" w:line="278" w:lineRule="auto"/>
+      <w:ind w:left="0" w:firstLine="0"/>
+      <w:outlineLvl w:val="2"/>
+    </w:pPr>
+    <w:rPr>
+      <w:rFonts w:asciiTheme="minorHAnsi" w:eastAsiaTheme="majorEastAsia" w:hAnsiTheme="minorHAnsi" w:cstheme="majorBidi"/>
+      <w:color w:val="0F4761" w:themeColor="accent1" w:themeShade="BF"/>
       <w:sz w:val="28"/>
+      <w:szCs w:val="28"/>
+    </w:rPr>
+  </w:style>
+  <w:style w:type="paragraph" w:styleId="Heading4">
+    <w:name w:val="heading 4"/>
+    <w:basedOn w:val="Normal"/>
+    <w:next w:val="Normal"/>
+    <w:link w:val="Heading4Char"/>
+    <w:uiPriority w:val="9"/>
+    <w:semiHidden/>
+    <w:unhideWhenUsed/>
+    <w:qFormat/>
+    <w:rsid w:val="00EB775C"/>
+    <w:pPr>
+      <w:keepNext/>
+      <w:keepLines/>
+      <w:spacing w:before="80" w:after="40" w:line="278" w:lineRule="auto"/>
+      <w:ind w:left="0" w:firstLine="0"/>
+      <w:outlineLvl w:val="3"/>
+    </w:pPr>
+    <w:rPr>
+      <w:rFonts w:asciiTheme="minorHAnsi" w:eastAsiaTheme="majorEastAsia" w:hAnsiTheme="minorHAnsi" w:cstheme="majorBidi"/>
+      <w:i/>
+      <w:iCs/>
+      <w:color w:val="0F4761" w:themeColor="accent1" w:themeShade="BF"/>
+      <w:sz w:val="24"/>
+    </w:rPr>
+  </w:style>
+  <w:style w:type="paragraph" w:styleId="Heading5">
+    <w:name w:val="heading 5"/>
+    <w:basedOn w:val="Normal"/>
+    <w:next w:val="Normal"/>
+    <w:link w:val="Heading5Char"/>
+    <w:uiPriority w:val="9"/>
+    <w:semiHidden/>
+    <w:unhideWhenUsed/>
+    <w:qFormat/>
+    <w:rsid w:val="00EB775C"/>
+    <w:pPr>
+      <w:keepNext/>
+      <w:keepLines/>
+      <w:spacing w:before="80" w:after="40" w:line="278" w:lineRule="auto"/>
+      <w:ind w:left="0" w:firstLine="0"/>
+      <w:outlineLvl w:val="4"/>
+    </w:pPr>
+    <w:rPr>
+      <w:rFonts w:asciiTheme="minorHAnsi" w:eastAsiaTheme="majorEastAsia" w:hAnsiTheme="minorHAnsi" w:cstheme="majorBidi"/>
+      <w:color w:val="0F4761" w:themeColor="accent1" w:themeShade="BF"/>
+      <w:sz w:val="24"/>
+    </w:rPr>
+  </w:style>
+  <w:style w:type="paragraph" w:styleId="Heading6">
+    <w:name w:val="heading 6"/>
+    <w:basedOn w:val="Normal"/>
+    <w:next w:val="Normal"/>
+    <w:link w:val="Heading6Char"/>
+    <w:uiPriority w:val="9"/>
+    <w:semiHidden/>
+    <w:unhideWhenUsed/>
+    <w:qFormat/>
+    <w:rsid w:val="00EB775C"/>
+    <w:pPr>
+      <w:keepNext/>
+      <w:keepLines/>
+      <w:spacing w:before="40" w:after="0" w:line="278" w:lineRule="auto"/>
+      <w:ind w:left="0" w:firstLine="0"/>
+      <w:outlineLvl w:val="5"/>
+    </w:pPr>
+    <w:rPr>
+      <w:rFonts w:asciiTheme="minorHAnsi" w:eastAsiaTheme="majorEastAsia" w:hAnsiTheme="minorHAnsi" w:cstheme="majorBidi"/>
+      <w:i/>
+      <w:iCs/>
+      <w:color w:val="595959" w:themeColor="text1" w:themeTint="A6"/>
+      <w:sz w:val="24"/>
+    </w:rPr>
+  </w:style>
+  <w:style w:type="paragraph" w:styleId="Heading7">
+    <w:name w:val="heading 7"/>
+    <w:basedOn w:val="Normal"/>
+    <w:next w:val="Normal"/>
+    <w:link w:val="Heading7Char"/>
+    <w:uiPriority w:val="9"/>
+    <w:semiHidden/>
+    <w:unhideWhenUsed/>
+    <w:qFormat/>
+    <w:rsid w:val="00EB775C"/>
+    <w:pPr>
+      <w:keepNext/>
+      <w:keepLines/>
+      <w:spacing w:before="40" w:after="0" w:line="278" w:lineRule="auto"/>
+      <w:ind w:left="0" w:firstLine="0"/>
+      <w:outlineLvl w:val="6"/>
+    </w:pPr>
+    <w:rPr>
+      <w:rFonts w:asciiTheme="minorHAnsi" w:eastAsiaTheme="majorEastAsia" w:hAnsiTheme="minorHAnsi" w:cstheme="majorBidi"/>
+      <w:color w:val="595959" w:themeColor="text1" w:themeTint="A6"/>
+      <w:sz w:val="24"/>
+    </w:rPr>
+  </w:style>
+  <w:style w:type="paragraph" w:styleId="Heading8">
+    <w:name w:val="heading 8"/>
+    <w:basedOn w:val="Normal"/>
+    <w:next w:val="Normal"/>
+    <w:link w:val="Heading8Char"/>
+    <w:uiPriority w:val="9"/>
+    <w:semiHidden/>
+    <w:unhideWhenUsed/>
+    <w:qFormat/>
+    <w:rsid w:val="00EB775C"/>
+    <w:pPr>
+      <w:keepNext/>
+      <w:keepLines/>
+      <w:spacing w:after="0" w:line="278" w:lineRule="auto"/>
+      <w:ind w:left="0" w:firstLine="0"/>
+      <w:outlineLvl w:val="7"/>
+    </w:pPr>
+    <w:rPr>
+      <w:rFonts w:asciiTheme="minorHAnsi" w:eastAsiaTheme="majorEastAsia" w:hAnsiTheme="minorHAnsi" w:cstheme="majorBidi"/>
+      <w:i/>
+      <w:iCs/>
+      <w:color w:val="272727" w:themeColor="text1" w:themeTint="D8"/>
+      <w:sz w:val="24"/>
+    </w:rPr>
+  </w:style>
+  <w:style w:type="paragraph" w:styleId="Heading9">
+    <w:name w:val="heading 9"/>
+    <w:basedOn w:val="Normal"/>
+    <w:next w:val="Normal"/>
+    <w:link w:val="Heading9Char"/>
+    <w:uiPriority w:val="9"/>
+    <w:semiHidden/>
+    <w:unhideWhenUsed/>
+    <w:qFormat/>
+    <w:rsid w:val="00EB775C"/>
+    <w:pPr>
+      <w:keepNext/>
+      <w:keepLines/>
+      <w:spacing w:after="0" w:line="278" w:lineRule="auto"/>
+      <w:ind w:left="0" w:firstLine="0"/>
+      <w:outlineLvl w:val="8"/>
+    </w:pPr>
+    <w:rPr>
+      <w:rFonts w:asciiTheme="minorHAnsi" w:eastAsiaTheme="majorEastAsia" w:hAnsiTheme="minorHAnsi" w:cstheme="majorBidi"/>
+      <w:color w:val="272727" w:themeColor="text1" w:themeTint="D8"/>
+      <w:sz w:val="24"/>
     </w:rPr>
   </w:style>
   <w:style w:type="character" w:default="1" w:styleId="DefaultParagraphFont">
@@ -911,12 +1107,306 @@
   </w:style>
   <w:style w:type="character" w:customStyle="1" w:styleId="Heading1Char">
     <w:name w:val="Heading 1 Char"/>
+    <w:basedOn w:val="DefaultParagraphFont"/>
     <w:link w:val="Heading1"/>
-    <w:rPr>
-      <w:rFonts w:ascii="Arial" w:eastAsia="Arial" w:hAnsi="Arial" w:cs="Arial"/>
+    <w:uiPriority w:val="9"/>
+    <w:rsid w:val="00EB775C"/>
+    <w:rPr>
+      <w:rFonts w:asciiTheme="majorHAnsi" w:eastAsiaTheme="majorEastAsia" w:hAnsiTheme="majorHAnsi" w:cstheme="majorBidi"/>
+      <w:color w:val="0F4761" w:themeColor="accent1" w:themeShade="BF"/>
+      <w:sz w:val="40"/>
+      <w:szCs w:val="40"/>
+    </w:rPr>
+  </w:style>
+  <w:style w:type="character" w:customStyle="1" w:styleId="Heading2Char">
+    <w:name w:val="Heading 2 Char"/>
+    <w:basedOn w:val="DefaultParagraphFont"/>
+    <w:link w:val="Heading2"/>
+    <w:uiPriority w:val="9"/>
+    <w:semiHidden/>
+    <w:rsid w:val="00EB775C"/>
+    <w:rPr>
+      <w:rFonts w:asciiTheme="majorHAnsi" w:eastAsiaTheme="majorEastAsia" w:hAnsiTheme="majorHAnsi" w:cstheme="majorBidi"/>
+      <w:color w:val="0F4761" w:themeColor="accent1" w:themeShade="BF"/>
+      <w:sz w:val="32"/>
+      <w:szCs w:val="32"/>
+    </w:rPr>
+  </w:style>
+  <w:style w:type="character" w:customStyle="1" w:styleId="Heading3Char">
+    <w:name w:val="Heading 3 Char"/>
+    <w:basedOn w:val="DefaultParagraphFont"/>
+    <w:link w:val="Heading3"/>
+    <w:uiPriority w:val="9"/>
+    <w:semiHidden/>
+    <w:rsid w:val="00EB775C"/>
+    <w:rPr>
+      <w:rFonts w:eastAsiaTheme="majorEastAsia" w:cstheme="majorBidi"/>
+      <w:color w:val="0F4761" w:themeColor="accent1" w:themeShade="BF"/>
+      <w:sz w:val="28"/>
+      <w:szCs w:val="28"/>
+    </w:rPr>
+  </w:style>
+  <w:style w:type="character" w:customStyle="1" w:styleId="Heading4Char">
+    <w:name w:val="Heading 4 Char"/>
+    <w:basedOn w:val="DefaultParagraphFont"/>
+    <w:link w:val="Heading4"/>
+    <w:uiPriority w:val="9"/>
+    <w:semiHidden/>
+    <w:rsid w:val="00EB775C"/>
+    <w:rPr>
+      <w:rFonts w:eastAsiaTheme="majorEastAsia" w:cstheme="majorBidi"/>
+      <w:i/>
+      <w:iCs/>
+      <w:color w:val="0F4761" w:themeColor="accent1" w:themeShade="BF"/>
+    </w:rPr>
+  </w:style>
+  <w:style w:type="character" w:customStyle="1" w:styleId="Heading5Char">
+    <w:name w:val="Heading 5 Char"/>
+    <w:basedOn w:val="DefaultParagraphFont"/>
+    <w:link w:val="Heading5"/>
+    <w:uiPriority w:val="9"/>
+    <w:semiHidden/>
+    <w:rsid w:val="00EB775C"/>
+    <w:rPr>
+      <w:rFonts w:eastAsiaTheme="majorEastAsia" w:cstheme="majorBidi"/>
+      <w:color w:val="0F4761" w:themeColor="accent1" w:themeShade="BF"/>
+    </w:rPr>
+  </w:style>
+  <w:style w:type="character" w:customStyle="1" w:styleId="Heading6Char">
+    <w:name w:val="Heading 6 Char"/>
+    <w:basedOn w:val="DefaultParagraphFont"/>
+    <w:link w:val="Heading6"/>
+    <w:uiPriority w:val="9"/>
+    <w:semiHidden/>
+    <w:rsid w:val="00EB775C"/>
+    <w:rPr>
+      <w:rFonts w:eastAsiaTheme="majorEastAsia" w:cstheme="majorBidi"/>
+      <w:i/>
+      <w:iCs/>
+      <w:color w:val="595959" w:themeColor="text1" w:themeTint="A6"/>
+    </w:rPr>
+  </w:style>
+  <w:style w:type="character" w:customStyle="1" w:styleId="Heading7Char">
+    <w:name w:val="Heading 7 Char"/>
+    <w:basedOn w:val="DefaultParagraphFont"/>
+    <w:link w:val="Heading7"/>
+    <w:uiPriority w:val="9"/>
+    <w:semiHidden/>
+    <w:rsid w:val="00EB775C"/>
+    <w:rPr>
+      <w:rFonts w:eastAsiaTheme="majorEastAsia" w:cstheme="majorBidi"/>
+      <w:color w:val="595959" w:themeColor="text1" w:themeTint="A6"/>
+    </w:rPr>
+  </w:style>
+  <w:style w:type="character" w:customStyle="1" w:styleId="Heading8Char">
+    <w:name w:val="Heading 8 Char"/>
+    <w:basedOn w:val="DefaultParagraphFont"/>
+    <w:link w:val="Heading8"/>
+    <w:uiPriority w:val="9"/>
+    <w:semiHidden/>
+    <w:rsid w:val="00EB775C"/>
+    <w:rPr>
+      <w:rFonts w:eastAsiaTheme="majorEastAsia" w:cstheme="majorBidi"/>
+      <w:i/>
+      <w:iCs/>
+      <w:color w:val="272727" w:themeColor="text1" w:themeTint="D8"/>
+    </w:rPr>
+  </w:style>
+  <w:style w:type="character" w:customStyle="1" w:styleId="Heading9Char">
+    <w:name w:val="Heading 9 Char"/>
+    <w:basedOn w:val="DefaultParagraphFont"/>
+    <w:link w:val="Heading9"/>
+    <w:uiPriority w:val="9"/>
+    <w:semiHidden/>
+    <w:rsid w:val="00EB775C"/>
+    <w:rPr>
+      <w:rFonts w:eastAsiaTheme="majorEastAsia" w:cstheme="majorBidi"/>
+      <w:color w:val="272727" w:themeColor="text1" w:themeTint="D8"/>
+    </w:rPr>
+  </w:style>
+  <w:style w:type="paragraph" w:styleId="Title">
+    <w:name w:val="Title"/>
+    <w:basedOn w:val="Normal"/>
+    <w:next w:val="Normal"/>
+    <w:link w:val="TitleChar"/>
+    <w:uiPriority w:val="10"/>
+    <w:qFormat/>
+    <w:rsid w:val="00EB775C"/>
+    <w:pPr>
+      <w:spacing w:after="80" w:line="240" w:lineRule="auto"/>
+      <w:ind w:left="0" w:firstLine="0"/>
+      <w:contextualSpacing/>
+    </w:pPr>
+    <w:rPr>
+      <w:rFonts w:asciiTheme="majorHAnsi" w:eastAsiaTheme="majorEastAsia" w:hAnsiTheme="majorHAnsi" w:cstheme="majorBidi"/>
+      <w:color w:val="auto"/>
+      <w:spacing w:val="-10"/>
+      <w:kern w:val="28"/>
+      <w:sz w:val="56"/>
+      <w:szCs w:val="56"/>
+    </w:rPr>
+  </w:style>
+  <w:style w:type="character" w:customStyle="1" w:styleId="TitleChar">
+    <w:name w:val="Title Char"/>
+    <w:basedOn w:val="DefaultParagraphFont"/>
+    <w:link w:val="Title"/>
+    <w:uiPriority w:val="10"/>
+    <w:rsid w:val="00EB775C"/>
+    <w:rPr>
+      <w:rFonts w:asciiTheme="majorHAnsi" w:eastAsiaTheme="majorEastAsia" w:hAnsiTheme="majorHAnsi" w:cstheme="majorBidi"/>
+      <w:spacing w:val="-10"/>
+      <w:kern w:val="28"/>
+      <w:sz w:val="56"/>
+      <w:szCs w:val="56"/>
+    </w:rPr>
+  </w:style>
+  <w:style w:type="paragraph" w:styleId="Subtitle">
+    <w:name w:val="Subtitle"/>
+    <w:basedOn w:val="Normal"/>
+    <w:next w:val="Normal"/>
+    <w:link w:val="SubtitleChar"/>
+    <w:uiPriority w:val="11"/>
+    <w:qFormat/>
+    <w:rsid w:val="00EB775C"/>
+    <w:pPr>
+      <w:numPr>
+        <w:ilvl w:val="1"/>
+      </w:numPr>
+      <w:spacing w:after="160" w:line="278" w:lineRule="auto"/>
+    </w:pPr>
+    <w:rPr>
+      <w:rFonts w:asciiTheme="minorHAnsi" w:eastAsiaTheme="majorEastAsia" w:hAnsiTheme="minorHAnsi" w:cstheme="majorBidi"/>
+      <w:color w:val="595959" w:themeColor="text1" w:themeTint="A6"/>
+      <w:spacing w:val="15"/>
+      <w:sz w:val="28"/>
+      <w:szCs w:val="28"/>
+    </w:rPr>
+  </w:style>
+  <w:style w:type="character" w:customStyle="1" w:styleId="SubtitleChar">
+    <w:name w:val="Subtitle Char"/>
+    <w:basedOn w:val="DefaultParagraphFont"/>
+    <w:link w:val="Subtitle"/>
+    <w:uiPriority w:val="11"/>
+    <w:rsid w:val="00EB775C"/>
+    <w:rPr>
+      <w:rFonts w:eastAsiaTheme="majorEastAsia" w:cstheme="majorBidi"/>
+      <w:color w:val="595959" w:themeColor="text1" w:themeTint="A6"/>
+      <w:spacing w:val="15"/>
+      <w:sz w:val="28"/>
+      <w:szCs w:val="28"/>
+    </w:rPr>
+  </w:style>
+  <w:style w:type="paragraph" w:styleId="Quote">
+    <w:name w:val="Quote"/>
+    <w:basedOn w:val="Normal"/>
+    <w:next w:val="Normal"/>
+    <w:link w:val="QuoteChar"/>
+    <w:uiPriority w:val="29"/>
+    <w:qFormat/>
+    <w:rsid w:val="00EB775C"/>
+    <w:pPr>
+      <w:spacing w:before="160" w:after="160" w:line="278" w:lineRule="auto"/>
+      <w:ind w:left="0" w:firstLine="0"/>
+      <w:jc w:val="center"/>
+    </w:pPr>
+    <w:rPr>
+      <w:rFonts w:asciiTheme="minorHAnsi" w:eastAsiaTheme="minorHAnsi" w:hAnsiTheme="minorHAnsi" w:cstheme="minorBidi"/>
+      <w:i/>
+      <w:iCs/>
+      <w:color w:val="404040" w:themeColor="text1" w:themeTint="BF"/>
+      <w:sz w:val="24"/>
+    </w:rPr>
+  </w:style>
+  <w:style w:type="character" w:customStyle="1" w:styleId="QuoteChar">
+    <w:name w:val="Quote Char"/>
+    <w:basedOn w:val="DefaultParagraphFont"/>
+    <w:link w:val="Quote"/>
+    <w:uiPriority w:val="29"/>
+    <w:rsid w:val="00EB775C"/>
+    <w:rPr>
+      <w:i/>
+      <w:iCs/>
+      <w:color w:val="404040" w:themeColor="text1" w:themeTint="BF"/>
+    </w:rPr>
+  </w:style>
+  <w:style w:type="paragraph" w:styleId="ListParagraph">
+    <w:name w:val="List Paragraph"/>
+    <w:basedOn w:val="Normal"/>
+    <w:uiPriority w:val="34"/>
+    <w:qFormat/>
+    <w:rsid w:val="00EB775C"/>
+    <w:pPr>
+      <w:spacing w:after="160" w:line="278" w:lineRule="auto"/>
+      <w:ind w:left="720" w:firstLine="0"/>
+      <w:contextualSpacing/>
+    </w:pPr>
+    <w:rPr>
+      <w:rFonts w:asciiTheme="minorHAnsi" w:eastAsiaTheme="minorHAnsi" w:hAnsiTheme="minorHAnsi" w:cstheme="minorBidi"/>
+      <w:color w:val="auto"/>
+      <w:sz w:val="24"/>
+    </w:rPr>
+  </w:style>
+  <w:style w:type="character" w:styleId="IntenseEmphasis">
+    <w:name w:val="Intense Emphasis"/>
+    <w:basedOn w:val="DefaultParagraphFont"/>
+    <w:uiPriority w:val="21"/>
+    <w:qFormat/>
+    <w:rsid w:val="00EB775C"/>
+    <w:rPr>
+      <w:i/>
+      <w:iCs/>
+      <w:color w:val="0F4761" w:themeColor="accent1" w:themeShade="BF"/>
+    </w:rPr>
+  </w:style>
+  <w:style w:type="paragraph" w:styleId="IntenseQuote">
+    <w:name w:val="Intense Quote"/>
+    <w:basedOn w:val="Normal"/>
+    <w:next w:val="Normal"/>
+    <w:link w:val="IntenseQuoteChar"/>
+    <w:uiPriority w:val="30"/>
+    <w:qFormat/>
+    <w:rsid w:val="00EB775C"/>
+    <w:pPr>
+      <w:pBdr>
+        <w:top w:val="single" w:sz="4" w:space="10" w:color="0F4761" w:themeColor="accent1" w:themeShade="BF"/>
+        <w:bottom w:val="single" w:sz="4" w:space="10" w:color="0F4761" w:themeColor="accent1" w:themeShade="BF"/>
+      </w:pBdr>
+      <w:spacing w:before="360" w:after="360" w:line="278" w:lineRule="auto"/>
+      <w:ind w:left="864" w:right="864" w:firstLine="0"/>
+      <w:jc w:val="center"/>
+    </w:pPr>
+    <w:rPr>
+      <w:rFonts w:asciiTheme="minorHAnsi" w:eastAsiaTheme="minorHAnsi" w:hAnsiTheme="minorHAnsi" w:cstheme="minorBidi"/>
+      <w:i/>
+      <w:iCs/>
+      <w:color w:val="0F4761" w:themeColor="accent1" w:themeShade="BF"/>
+      <w:sz w:val="24"/>
+    </w:rPr>
+  </w:style>
+  <w:style w:type="character" w:customStyle="1" w:styleId="IntenseQuoteChar">
+    <w:name w:val="Intense Quote Char"/>
+    <w:basedOn w:val="DefaultParagraphFont"/>
+    <w:link w:val="IntenseQuote"/>
+    <w:uiPriority w:val="30"/>
+    <w:rsid w:val="00EB775C"/>
+    <w:rPr>
+      <w:i/>
+      <w:iCs/>
+      <w:color w:val="0F4761" w:themeColor="accent1" w:themeShade="BF"/>
+    </w:rPr>
+  </w:style>
+  <w:style w:type="character" w:styleId="IntenseReference">
+    <w:name w:val="Intense Reference"/>
+    <w:basedOn w:val="DefaultParagraphFont"/>
+    <w:uiPriority w:val="32"/>
+    <w:qFormat/>
+    <w:rsid w:val="00EB775C"/>
+    <w:rPr>
       <w:b/>
-      <w:color w:val="000000"/>
-      <w:sz w:val="28"/>
+      <w:bCs/>
+      <w:smallCaps/>
+      <w:color w:val="0F4761" w:themeColor="accent1" w:themeShade="BF"/>
+      <w:spacing w:val="5"/>
     </w:rPr>
   </w:style>
 </w:styles>

</xml_diff>